<commit_message>
docs(qa): correct stale BE-based claims in Report1/6, unify Report4 formatting
- Revert Report1 FE-21 and Report6 Workflow 1/2 claims that were wrongly flagged as gaps due to an outdated local backend checkout (GitHub OAuth, Admin JSONL upload, and JD-analyze now confirmed real against current backend)
- Report4: unify font to Times New Roman and body text to 12pt across the whole document, remove all em/en-dashes, add page break before each of the 73 entries, force a TOC refresh prompt
</commit_message>
<xml_diff>
--- a/docs/qa/Report6_Software_User_Guides.docx
+++ b/docs/qa/Report6_Software_User_Guides.docx
@@ -5441,7 +5441,7 @@
         <w:rPr>
           <w:sz w:val="24"/>
         </w:rPr>
-        <w:t xml:space="preserve">Choose the knowledge scope/folder and upload PDF/DOCX/TXT (HR); the Admin JSONL Q/A path exists in the UI, but the backend's configured allowed extensions do not currently include .jsonl, so that path does not succeed against the checked-in configuration. Upload the document and note its document ID; track its status from QUEUED to PROCESSING to COMPLETED (with chunk count); then review failed stages before reingesting, delete it if no longer needed, and attach the documents in Studio.</w:t>
+        <w:t xml:space="preserve">Choose the knowledge scope/folder and upload PDF/DOCX/TXT (HR) or JSONL Q/A (Admin); upload the document and note its document ID; track its status from QUEUED to PROCESSING to COMPLETED (with chunk count); then review failed stages before reingesting, delete it if no longer needed, and attach the documents in Studio.</w:t>
       </w:r>
     </w:p>
     <w:p>
@@ -5681,7 +5681,7 @@
         <w:rPr>
           <w:sz w:val="24"/>
         </w:rPr>
-        <w:t xml:space="preserve">Create or open a project and paste or upload the JD; analyze the JD (this step uses a rule-based mock analyzer rather than a live AI call) and confirm its role, skills and metadata, attaching relevant HR documents; generate the interview plan and review and approve it; generate the questions and wait for the run to reach Completed; then review the wording, rubric and citations, regenerate as needed, and save the result as a question set.</w:t>
+        <w:t xml:space="preserve">Create or open a project and paste or upload the JD; analyze the JD and confirm its role, skills and metadata, attaching relevant HR documents; generate the interview plan and review and approve it; generate the questions and wait for the run to reach Completed; then review the wording, rubric and citations, regenerate as needed, and save the result as a question set.</w:t>
       </w:r>
     </w:p>
     <w:p>

</xml_diff>